<commit_message>
atualização da aula 14/06/2026
</commit_message>
<xml_diff>
--- a/apostila/Apostila Space For Men.docx
+++ b/apostila/Apostila Space For Men.docx
@@ -4174,6 +4174,7 @@
       </w:pPr>
       <w:r>
         <w:rPr>
+          <w:noProof/>
           <w:sz w:val="24"/>
           <w:szCs w:val="24"/>
         </w:rPr>
@@ -4215,6 +4216,7 @@
       </w:r>
       <w:r>
         <w:rPr>
+          <w:noProof/>
           <w:sz w:val="24"/>
           <w:szCs w:val="24"/>
         </w:rPr>
@@ -4434,6 +4436,7 @@
       </w:pPr>
       <w:r>
         <w:rPr>
+          <w:noProof/>
           <w:sz w:val="24"/>
           <w:szCs w:val="24"/>
         </w:rPr>
@@ -4533,6 +4536,7 @@
       </w:pPr>
       <w:r>
         <w:rPr>
+          <w:noProof/>
           <w:sz w:val="24"/>
           <w:szCs w:val="24"/>
         </w:rPr>
@@ -4574,6 +4578,7 @@
       </w:r>
       <w:r>
         <w:rPr>
+          <w:noProof/>
           <w:sz w:val="24"/>
           <w:szCs w:val="24"/>
         </w:rPr>
@@ -4713,6 +4718,7 @@
       </w:pPr>
       <w:r>
         <w:rPr>
+          <w:noProof/>
           <w:sz w:val="24"/>
           <w:szCs w:val="24"/>
         </w:rPr>
@@ -4834,6 +4840,7 @@
       </w:pPr>
       <w:r>
         <w:rPr>
+          <w:noProof/>
           <w:sz w:val="24"/>
           <w:szCs w:val="24"/>
         </w:rPr>
@@ -5082,9 +5089,9 @@
           <w:szCs w:val="24"/>
         </w:rPr>
       </w:pPr>
-      <w:bookmarkStart w:id="0" w:name="_GoBack"/>
-      <w:r>
-        <w:rPr>
+      <w:r>
+        <w:rPr>
+          <w:noProof/>
           <w:sz w:val="24"/>
           <w:szCs w:val="24"/>
         </w:rPr>
@@ -5124,26 +5131,1318 @@
           </wp:inline>
         </w:drawing>
       </w:r>
+      <w:r>
+        <w:rPr>
+          <w:sz w:val="24"/>
+          <w:szCs w:val="24"/>
+        </w:rPr>
+        <w:br w:type="page"/>
+      </w:r>
+    </w:p>
+    <w:p>
+      <w:pPr>
+        <w:pStyle w:val="PargrafodaLista"/>
+        <w:tabs>
+          <w:tab w:val="left" w:pos="1275"/>
+        </w:tabs>
+        <w:rPr>
+          <w:sz w:val="24"/>
+          <w:szCs w:val="24"/>
+        </w:rPr>
+      </w:pPr>
+      <w:r>
+        <w:rPr>
+          <w:sz w:val="24"/>
+          <w:szCs w:val="24"/>
+        </w:rPr>
+        <w:t xml:space="preserve">27 – Trabalhando com </w:t>
+      </w:r>
+      <w:proofErr w:type="spellStart"/>
+      <w:r>
+        <w:rPr>
+          <w:sz w:val="24"/>
+          <w:szCs w:val="24"/>
+        </w:rPr>
+        <w:t>Main</w:t>
+      </w:r>
+      <w:proofErr w:type="spellEnd"/>
+      <w:r>
+        <w:rPr>
+          <w:sz w:val="24"/>
+          <w:szCs w:val="24"/>
+        </w:rPr>
+        <w:t xml:space="preserve"> criamos uma lista não ordenada onde inserimos um subtítulo, imagem e parágrafos para cada item da lista conforme imagem:</w:t>
+      </w:r>
+    </w:p>
+    <w:p>
+      <w:pPr>
+        <w:pStyle w:val="PargrafodaLista"/>
+        <w:tabs>
+          <w:tab w:val="left" w:pos="1275"/>
+        </w:tabs>
+        <w:rPr>
+          <w:sz w:val="24"/>
+          <w:szCs w:val="24"/>
+        </w:rPr>
+      </w:pPr>
+    </w:p>
+    <w:p>
+      <w:pPr>
+        <w:pStyle w:val="PargrafodaLista"/>
+        <w:tabs>
+          <w:tab w:val="left" w:pos="1275"/>
+        </w:tabs>
+        <w:rPr>
+          <w:sz w:val="24"/>
+          <w:szCs w:val="24"/>
+        </w:rPr>
+      </w:pPr>
+      <w:r>
+        <w:rPr>
+          <w:sz w:val="24"/>
+          <w:szCs w:val="24"/>
+        </w:rPr>
+        <w:drawing>
+          <wp:inline distT="0" distB="0" distL="0" distR="0" wp14:anchorId="280D0720" wp14:editId="0BD9183F">
+            <wp:extent cx="5782482" cy="4486901"/>
+            <wp:effectExtent l="0" t="0" r="8890" b="9525"/>
+            <wp:docPr id="38" name="Imagem 38"/>
+            <wp:cNvGraphicFramePr>
+              <a:graphicFrameLocks xmlns:a="http://schemas.openxmlformats.org/drawingml/2006/main" noChangeAspect="1"/>
+            </wp:cNvGraphicFramePr>
+            <a:graphic xmlns:a="http://schemas.openxmlformats.org/drawingml/2006/main">
+              <a:graphicData uri="http://schemas.openxmlformats.org/drawingml/2006/picture">
+                <pic:pic xmlns:pic="http://schemas.openxmlformats.org/drawingml/2006/picture">
+                  <pic:nvPicPr>
+                    <pic:cNvPr id="1" name=""/>
+                    <pic:cNvPicPr/>
+                  </pic:nvPicPr>
+                  <pic:blipFill>
+                    <a:blip r:embed="rId45"/>
+                    <a:stretch>
+                      <a:fillRect/>
+                    </a:stretch>
+                  </pic:blipFill>
+                  <pic:spPr>
+                    <a:xfrm>
+                      <a:off x="0" y="0"/>
+                      <a:ext cx="5782482" cy="4486901"/>
+                    </a:xfrm>
+                    <a:prstGeom prst="rect">
+                      <a:avLst/>
+                    </a:prstGeom>
+                  </pic:spPr>
+                </pic:pic>
+              </a:graphicData>
+            </a:graphic>
+          </wp:inline>
+        </w:drawing>
+      </w:r>
+      <w:r>
+        <w:rPr>
+          <w:sz w:val="24"/>
+          <w:szCs w:val="24"/>
+        </w:rPr>
+        <w:t xml:space="preserve"> </w:t>
+      </w:r>
+    </w:p>
+    <w:p>
+      <w:pPr>
+        <w:pStyle w:val="PargrafodaLista"/>
+        <w:tabs>
+          <w:tab w:val="left" w:pos="1275"/>
+        </w:tabs>
+        <w:rPr>
+          <w:sz w:val="24"/>
+          <w:szCs w:val="24"/>
+        </w:rPr>
+      </w:pPr>
+    </w:p>
+    <w:p>
+      <w:pPr>
+        <w:pStyle w:val="PargrafodaLista"/>
+        <w:tabs>
+          <w:tab w:val="left" w:pos="1275"/>
+        </w:tabs>
+        <w:rPr>
+          <w:sz w:val="24"/>
+          <w:szCs w:val="24"/>
+        </w:rPr>
+      </w:pPr>
+      <w:r>
+        <w:rPr>
+          <w:noProof/>
+          <w:sz w:val="24"/>
+          <w:szCs w:val="24"/>
+        </w:rPr>
+        <mc:AlternateContent>
+          <mc:Choice Requires="wps">
+            <w:drawing>
+              <wp:anchor distT="0" distB="0" distL="114300" distR="114300" simplePos="0" relativeHeight="251665408" behindDoc="0" locked="0" layoutInCell="1" allowOverlap="1">
+                <wp:simplePos x="0" y="0"/>
+                <wp:positionH relativeFrom="column">
+                  <wp:posOffset>2252127</wp:posOffset>
+                </wp:positionH>
+                <wp:positionV relativeFrom="paragraph">
+                  <wp:posOffset>191097</wp:posOffset>
+                </wp:positionV>
+                <wp:extent cx="3487003" cy="689212"/>
+                <wp:effectExtent l="38100" t="0" r="18415" b="73025"/>
+                <wp:wrapNone/>
+                <wp:docPr id="40" name="Conector de Seta Reta 40"/>
+                <wp:cNvGraphicFramePr/>
+                <a:graphic xmlns:a="http://schemas.openxmlformats.org/drawingml/2006/main">
+                  <a:graphicData uri="http://schemas.microsoft.com/office/word/2010/wordprocessingShape">
+                    <wps:wsp>
+                      <wps:cNvCnPr/>
+                      <wps:spPr>
+                        <a:xfrm flipH="1">
+                          <a:off x="0" y="0"/>
+                          <a:ext cx="3487003" cy="689212"/>
+                        </a:xfrm>
+                        <a:prstGeom prst="straightConnector1">
+                          <a:avLst/>
+                        </a:prstGeom>
+                        <a:ln>
+                          <a:tailEnd type="triangle"/>
+                        </a:ln>
+                      </wps:spPr>
+                      <wps:style>
+                        <a:lnRef idx="1">
+                          <a:schemeClr val="accent1"/>
+                        </a:lnRef>
+                        <a:fillRef idx="0">
+                          <a:schemeClr val="accent1"/>
+                        </a:fillRef>
+                        <a:effectRef idx="0">
+                          <a:schemeClr val="accent1"/>
+                        </a:effectRef>
+                        <a:fontRef idx="minor">
+                          <a:schemeClr val="tx1"/>
+                        </a:fontRef>
+                      </wps:style>
+                      <wps:bodyPr/>
+                    </wps:wsp>
+                  </a:graphicData>
+                </a:graphic>
+              </wp:anchor>
+            </w:drawing>
+          </mc:Choice>
+          <mc:Fallback>
+            <w:pict>
+              <v:shapetype w14:anchorId="2D95EA6A" id="_x0000_t32" coordsize="21600,21600" o:spt="32" o:oned="t" path="m,l21600,21600e" filled="f">
+                <v:path arrowok="t" fillok="f" o:connecttype="none"/>
+                <o:lock v:ext="edit" shapetype="t"/>
+              </v:shapetype>
+              <v:shape id="Conector de Seta Reta 40" o:spid="_x0000_s1026" type="#_x0000_t32" style="position:absolute;margin-left:177.35pt;margin-top:15.05pt;width:274.55pt;height:54.25pt;flip:x;z-index:251665408;visibility:visible;mso-wrap-style:square;mso-wrap-distance-left:9pt;mso-wrap-distance-top:0;mso-wrap-distance-right:9pt;mso-wrap-distance-bottom:0;mso-position-horizontal:absolute;mso-position-horizontal-relative:text;mso-position-vertical:absolute;mso-position-vertical-relative:text" o:gfxdata="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" strokecolor="#4472c4 [3204]" strokeweight=".5pt">
+                <v:stroke endarrow="block" joinstyle="miter"/>
+              </v:shape>
+            </w:pict>
+          </mc:Fallback>
+        </mc:AlternateContent>
+      </w:r>
+      <w:r>
+        <w:rPr>
+          <w:sz w:val="24"/>
+          <w:szCs w:val="24"/>
+        </w:rPr>
+        <w:t>28 – Para colocar cada item da lista um ao lado do outro</w:t>
+      </w:r>
+      <w:r>
+        <w:rPr>
+          <w:sz w:val="24"/>
+          <w:szCs w:val="24"/>
+        </w:rPr>
+        <w:t xml:space="preserve"> inserimos uma classe na lista(</w:t>
+      </w:r>
+      <w:proofErr w:type="spellStart"/>
+      <w:r>
+        <w:rPr>
+          <w:sz w:val="24"/>
+          <w:szCs w:val="24"/>
+        </w:rPr>
+        <w:t>html</w:t>
+      </w:r>
+      <w:proofErr w:type="spellEnd"/>
+      <w:r>
+        <w:rPr>
+          <w:sz w:val="24"/>
+          <w:szCs w:val="24"/>
+        </w:rPr>
+        <w:t xml:space="preserve">) e no </w:t>
+      </w:r>
+      <w:proofErr w:type="spellStart"/>
+      <w:r>
+        <w:rPr>
+          <w:sz w:val="24"/>
+          <w:szCs w:val="24"/>
+        </w:rPr>
+        <w:t>css</w:t>
+      </w:r>
+      <w:proofErr w:type="spellEnd"/>
+      <w:r>
+        <w:rPr>
+          <w:sz w:val="24"/>
+          <w:szCs w:val="24"/>
+        </w:rPr>
+        <w:t xml:space="preserve"> </w:t>
+      </w:r>
+      <w:r>
+        <w:rPr>
+          <w:sz w:val="24"/>
+          <w:szCs w:val="24"/>
+        </w:rPr>
+        <w:t>adicionamos o</w:t>
+      </w:r>
+    </w:p>
+    <w:p>
+      <w:pPr>
+        <w:pStyle w:val="PargrafodaLista"/>
+        <w:tabs>
+          <w:tab w:val="left" w:pos="1275"/>
+        </w:tabs>
+        <w:rPr>
+          <w:sz w:val="24"/>
+          <w:szCs w:val="24"/>
+        </w:rPr>
+      </w:pPr>
+      <w:r>
+        <w:rPr>
+          <w:sz w:val="24"/>
+          <w:szCs w:val="24"/>
+        </w:rPr>
+        <w:t xml:space="preserve">Display: </w:t>
+      </w:r>
+      <w:proofErr w:type="spellStart"/>
+      <w:r>
+        <w:rPr>
+          <w:sz w:val="24"/>
+          <w:szCs w:val="24"/>
+        </w:rPr>
+        <w:t>inline-block</w:t>
+      </w:r>
+      <w:proofErr w:type="spellEnd"/>
+    </w:p>
+    <w:p>
+      <w:pPr>
+        <w:pStyle w:val="PargrafodaLista"/>
+        <w:tabs>
+          <w:tab w:val="left" w:pos="1275"/>
+        </w:tabs>
+        <w:rPr>
+          <w:sz w:val="24"/>
+          <w:szCs w:val="24"/>
+        </w:rPr>
+      </w:pPr>
+    </w:p>
+    <w:p>
+      <w:pPr>
+        <w:pStyle w:val="PargrafodaLista"/>
+        <w:tabs>
+          <w:tab w:val="left" w:pos="1275"/>
+        </w:tabs>
+        <w:rPr>
+          <w:sz w:val="24"/>
+          <w:szCs w:val="24"/>
+        </w:rPr>
+      </w:pPr>
+      <w:r>
+        <w:rPr>
+          <w:sz w:val="24"/>
+          <w:szCs w:val="24"/>
+        </w:rPr>
+        <w:drawing>
+          <wp:inline distT="0" distB="0" distL="0" distR="0" wp14:anchorId="00349A2D" wp14:editId="50D81DB5">
+            <wp:extent cx="4136009" cy="2122653"/>
+            <wp:effectExtent l="0" t="0" r="0" b="0"/>
+            <wp:docPr id="39" name="Imagem 39"/>
+            <wp:cNvGraphicFramePr>
+              <a:graphicFrameLocks xmlns:a="http://schemas.openxmlformats.org/drawingml/2006/main" noChangeAspect="1"/>
+            </wp:cNvGraphicFramePr>
+            <a:graphic xmlns:a="http://schemas.openxmlformats.org/drawingml/2006/main">
+              <a:graphicData uri="http://schemas.openxmlformats.org/drawingml/2006/picture">
+                <pic:pic xmlns:pic="http://schemas.openxmlformats.org/drawingml/2006/picture">
+                  <pic:nvPicPr>
+                    <pic:cNvPr id="1" name=""/>
+                    <pic:cNvPicPr/>
+                  </pic:nvPicPr>
+                  <pic:blipFill>
+                    <a:blip r:embed="rId46"/>
+                    <a:stretch>
+                      <a:fillRect/>
+                    </a:stretch>
+                  </pic:blipFill>
+                  <pic:spPr>
+                    <a:xfrm>
+                      <a:off x="0" y="0"/>
+                      <a:ext cx="4206035" cy="2158591"/>
+                    </a:xfrm>
+                    <a:prstGeom prst="rect">
+                      <a:avLst/>
+                    </a:prstGeom>
+                  </pic:spPr>
+                </pic:pic>
+              </a:graphicData>
+            </a:graphic>
+          </wp:inline>
+        </w:drawing>
+      </w:r>
+      <w:r>
+        <w:rPr>
+          <w:sz w:val="24"/>
+          <w:szCs w:val="24"/>
+        </w:rPr>
+        <w:drawing>
+          <wp:inline distT="0" distB="0" distL="0" distR="0" wp14:anchorId="58DA0A50" wp14:editId="5798300D">
+            <wp:extent cx="2675064" cy="1029837"/>
+            <wp:effectExtent l="0" t="0" r="0" b="0"/>
+            <wp:docPr id="47" name="Imagem 47"/>
+            <wp:cNvGraphicFramePr>
+              <a:graphicFrameLocks xmlns:a="http://schemas.openxmlformats.org/drawingml/2006/main" noChangeAspect="1"/>
+            </wp:cNvGraphicFramePr>
+            <a:graphic xmlns:a="http://schemas.openxmlformats.org/drawingml/2006/main">
+              <a:graphicData uri="http://schemas.openxmlformats.org/drawingml/2006/picture">
+                <pic:pic xmlns:pic="http://schemas.openxmlformats.org/drawingml/2006/picture">
+                  <pic:nvPicPr>
+                    <pic:cNvPr id="1" name=""/>
+                    <pic:cNvPicPr/>
+                  </pic:nvPicPr>
+                  <pic:blipFill>
+                    <a:blip r:embed="rId47"/>
+                    <a:stretch>
+                      <a:fillRect/>
+                    </a:stretch>
+                  </pic:blipFill>
+                  <pic:spPr>
+                    <a:xfrm>
+                      <a:off x="0" y="0"/>
+                      <a:ext cx="2705054" cy="1041383"/>
+                    </a:xfrm>
+                    <a:prstGeom prst="rect">
+                      <a:avLst/>
+                    </a:prstGeom>
+                  </pic:spPr>
+                </pic:pic>
+              </a:graphicData>
+            </a:graphic>
+          </wp:inline>
+        </w:drawing>
+      </w:r>
+    </w:p>
+    <w:p>
+      <w:pPr>
+        <w:pStyle w:val="PargrafodaLista"/>
+        <w:tabs>
+          <w:tab w:val="left" w:pos="1275"/>
+        </w:tabs>
+        <w:rPr>
+          <w:sz w:val="24"/>
+          <w:szCs w:val="24"/>
+        </w:rPr>
+      </w:pPr>
+      <w:r>
+        <w:rPr>
+          <w:sz w:val="24"/>
+          <w:szCs w:val="24"/>
+        </w:rPr>
+        <w:drawing>
+          <wp:inline distT="0" distB="0" distL="0" distR="0" wp14:anchorId="51D7A32D" wp14:editId="589BE511">
+            <wp:extent cx="6528052" cy="2558102"/>
+            <wp:effectExtent l="0" t="0" r="6350" b="0"/>
+            <wp:docPr id="48" name="Imagem 48"/>
+            <wp:cNvGraphicFramePr>
+              <a:graphicFrameLocks xmlns:a="http://schemas.openxmlformats.org/drawingml/2006/main" noChangeAspect="1"/>
+            </wp:cNvGraphicFramePr>
+            <a:graphic xmlns:a="http://schemas.openxmlformats.org/drawingml/2006/main">
+              <a:graphicData uri="http://schemas.openxmlformats.org/drawingml/2006/picture">
+                <pic:pic xmlns:pic="http://schemas.openxmlformats.org/drawingml/2006/picture">
+                  <pic:nvPicPr>
+                    <pic:cNvPr id="1" name=""/>
+                    <pic:cNvPicPr/>
+                  </pic:nvPicPr>
+                  <pic:blipFill>
+                    <a:blip r:embed="rId48"/>
+                    <a:stretch>
+                      <a:fillRect/>
+                    </a:stretch>
+                  </pic:blipFill>
+                  <pic:spPr>
+                    <a:xfrm>
+                      <a:off x="0" y="0"/>
+                      <a:ext cx="6564380" cy="2572338"/>
+                    </a:xfrm>
+                    <a:prstGeom prst="rect">
+                      <a:avLst/>
+                    </a:prstGeom>
+                  </pic:spPr>
+                </pic:pic>
+              </a:graphicData>
+            </a:graphic>
+          </wp:inline>
+        </w:drawing>
+      </w:r>
+    </w:p>
+    <w:p>
+      <w:pPr>
+        <w:pStyle w:val="PargrafodaLista"/>
+        <w:tabs>
+          <w:tab w:val="left" w:pos="1275"/>
+        </w:tabs>
+        <w:rPr>
+          <w:sz w:val="24"/>
+          <w:szCs w:val="24"/>
+        </w:rPr>
+      </w:pPr>
+    </w:p>
+    <w:p>
+      <w:pPr>
+        <w:pStyle w:val="PargrafodaLista"/>
+        <w:tabs>
+          <w:tab w:val="left" w:pos="1275"/>
+        </w:tabs>
+        <w:rPr>
+          <w:sz w:val="24"/>
+          <w:szCs w:val="24"/>
+        </w:rPr>
+      </w:pPr>
+      <w:r>
+        <w:rPr>
+          <w:sz w:val="24"/>
+          <w:szCs w:val="24"/>
+        </w:rPr>
+        <w:t xml:space="preserve">29 </w:t>
+      </w:r>
+      <w:r>
+        <w:rPr>
+          <w:sz w:val="24"/>
+          <w:szCs w:val="24"/>
+        </w:rPr>
+        <w:t>–</w:t>
+      </w:r>
+      <w:r>
+        <w:rPr>
+          <w:sz w:val="24"/>
+          <w:szCs w:val="24"/>
+        </w:rPr>
+        <w:t xml:space="preserve"> </w:t>
+      </w:r>
+      <w:r>
+        <w:rPr>
+          <w:sz w:val="24"/>
+          <w:szCs w:val="24"/>
+        </w:rPr>
+        <w:t xml:space="preserve">Para centralizar a lista demos uma largura e utilizamos o </w:t>
+      </w:r>
+      <w:proofErr w:type="spellStart"/>
+      <w:r>
+        <w:rPr>
+          <w:sz w:val="24"/>
+          <w:szCs w:val="24"/>
+        </w:rPr>
+        <w:t>margin</w:t>
+      </w:r>
+      <w:proofErr w:type="spellEnd"/>
+      <w:r>
+        <w:rPr>
+          <w:sz w:val="24"/>
+          <w:szCs w:val="24"/>
+        </w:rPr>
+        <w:t>: 0 auto</w:t>
+      </w:r>
+      <w:r>
+        <w:rPr>
+          <w:sz w:val="24"/>
+          <w:szCs w:val="24"/>
+        </w:rPr>
+        <w:t xml:space="preserve">, e aumentamos o espaço interno com o </w:t>
+      </w:r>
+      <w:proofErr w:type="spellStart"/>
+      <w:r>
+        <w:rPr>
+          <w:sz w:val="24"/>
+          <w:szCs w:val="24"/>
+        </w:rPr>
+        <w:t>padding</w:t>
+      </w:r>
+      <w:proofErr w:type="spellEnd"/>
+      <w:r>
+        <w:rPr>
+          <w:sz w:val="24"/>
+          <w:szCs w:val="24"/>
+        </w:rPr>
+        <w:t>.</w:t>
+      </w:r>
+    </w:p>
+    <w:p>
+      <w:pPr>
+        <w:pStyle w:val="PargrafodaLista"/>
+        <w:tabs>
+          <w:tab w:val="left" w:pos="1275"/>
+        </w:tabs>
+        <w:rPr>
+          <w:sz w:val="24"/>
+          <w:szCs w:val="24"/>
+        </w:rPr>
+      </w:pPr>
+    </w:p>
+    <w:p>
+      <w:pPr>
+        <w:pStyle w:val="PargrafodaLista"/>
+        <w:tabs>
+          <w:tab w:val="left" w:pos="1275"/>
+        </w:tabs>
+        <w:rPr>
+          <w:sz w:val="24"/>
+          <w:szCs w:val="24"/>
+        </w:rPr>
+      </w:pPr>
+      <w:r>
+        <w:rPr>
+          <w:sz w:val="24"/>
+          <w:szCs w:val="24"/>
+        </w:rPr>
+        <w:drawing>
+          <wp:inline distT="0" distB="0" distL="0" distR="0" wp14:anchorId="7057083D" wp14:editId="263CFA3F">
+            <wp:extent cx="3467584" cy="1771897"/>
+            <wp:effectExtent l="0" t="0" r="0" b="0"/>
+            <wp:docPr id="49" name="Imagem 49"/>
+            <wp:cNvGraphicFramePr>
+              <a:graphicFrameLocks xmlns:a="http://schemas.openxmlformats.org/drawingml/2006/main" noChangeAspect="1"/>
+            </wp:cNvGraphicFramePr>
+            <a:graphic xmlns:a="http://schemas.openxmlformats.org/drawingml/2006/main">
+              <a:graphicData uri="http://schemas.openxmlformats.org/drawingml/2006/picture">
+                <pic:pic xmlns:pic="http://schemas.openxmlformats.org/drawingml/2006/picture">
+                  <pic:nvPicPr>
+                    <pic:cNvPr id="1" name=""/>
+                    <pic:cNvPicPr/>
+                  </pic:nvPicPr>
+                  <pic:blipFill>
+                    <a:blip r:embed="rId49"/>
+                    <a:stretch>
+                      <a:fillRect/>
+                    </a:stretch>
+                  </pic:blipFill>
+                  <pic:spPr>
+                    <a:xfrm>
+                      <a:off x="0" y="0"/>
+                      <a:ext cx="3467584" cy="1771897"/>
+                    </a:xfrm>
+                    <a:prstGeom prst="rect">
+                      <a:avLst/>
+                    </a:prstGeom>
+                  </pic:spPr>
+                </pic:pic>
+              </a:graphicData>
+            </a:graphic>
+          </wp:inline>
+        </w:drawing>
+      </w:r>
+    </w:p>
+    <w:p>
+      <w:pPr>
+        <w:pStyle w:val="PargrafodaLista"/>
+        <w:tabs>
+          <w:tab w:val="left" w:pos="1275"/>
+        </w:tabs>
+        <w:rPr>
+          <w:sz w:val="24"/>
+          <w:szCs w:val="24"/>
+        </w:rPr>
+      </w:pPr>
+      <w:r>
+        <w:rPr>
+          <w:noProof/>
+          <w:sz w:val="24"/>
+          <w:szCs w:val="24"/>
+        </w:rPr>
+        <mc:AlternateContent>
+          <mc:Choice Requires="wps">
+            <w:drawing>
+              <wp:anchor distT="0" distB="0" distL="114300" distR="114300" simplePos="0" relativeHeight="251667456" behindDoc="0" locked="0" layoutInCell="1" allowOverlap="1">
+                <wp:simplePos x="0" y="0"/>
+                <wp:positionH relativeFrom="column">
+                  <wp:posOffset>2579673</wp:posOffset>
+                </wp:positionH>
+                <wp:positionV relativeFrom="paragraph">
+                  <wp:posOffset>175638</wp:posOffset>
+                </wp:positionV>
+                <wp:extent cx="3248167" cy="1337481"/>
+                <wp:effectExtent l="38100" t="0" r="28575" b="72390"/>
+                <wp:wrapNone/>
+                <wp:docPr id="52" name="Conector de Seta Reta 52"/>
+                <wp:cNvGraphicFramePr/>
+                <a:graphic xmlns:a="http://schemas.openxmlformats.org/drawingml/2006/main">
+                  <a:graphicData uri="http://schemas.microsoft.com/office/word/2010/wordprocessingShape">
+                    <wps:wsp>
+                      <wps:cNvCnPr/>
+                      <wps:spPr>
+                        <a:xfrm flipH="1">
+                          <a:off x="0" y="0"/>
+                          <a:ext cx="3248167" cy="1337481"/>
+                        </a:xfrm>
+                        <a:prstGeom prst="straightConnector1">
+                          <a:avLst/>
+                        </a:prstGeom>
+                        <a:ln>
+                          <a:tailEnd type="triangle"/>
+                        </a:ln>
+                      </wps:spPr>
+                      <wps:style>
+                        <a:lnRef idx="1">
+                          <a:schemeClr val="accent1"/>
+                        </a:lnRef>
+                        <a:fillRef idx="0">
+                          <a:schemeClr val="accent1"/>
+                        </a:fillRef>
+                        <a:effectRef idx="0">
+                          <a:schemeClr val="accent1"/>
+                        </a:effectRef>
+                        <a:fontRef idx="minor">
+                          <a:schemeClr val="tx1"/>
+                        </a:fontRef>
+                      </wps:style>
+                      <wps:bodyPr/>
+                    </wps:wsp>
+                  </a:graphicData>
+                </a:graphic>
+              </wp:anchor>
+            </w:drawing>
+          </mc:Choice>
+          <mc:Fallback>
+            <w:pict>
+              <v:shape w14:anchorId="14BC0347" id="Conector de Seta Reta 52" o:spid="_x0000_s1026" type="#_x0000_t32" style="position:absolute;margin-left:203.1pt;margin-top:13.85pt;width:255.75pt;height:105.3pt;flip:x;z-index:251667456;visibility:visible;mso-wrap-style:square;mso-wrap-distance-left:9pt;mso-wrap-distance-top:0;mso-wrap-distance-right:9pt;mso-wrap-distance-bottom:0;mso-position-horizontal:absolute;mso-position-horizontal-relative:text;mso-position-vertical:absolute;mso-position-vertical-relative:text" o:gfxdata="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" strokecolor="#4472c4 [3204]" strokeweight=".5pt">
+                <v:stroke endarrow="block" joinstyle="miter"/>
+              </v:shape>
+            </w:pict>
+          </mc:Fallback>
+        </mc:AlternateContent>
+      </w:r>
+      <w:r>
+        <w:rPr>
+          <w:noProof/>
+          <w:sz w:val="24"/>
+          <w:szCs w:val="24"/>
+        </w:rPr>
+        <mc:AlternateContent>
+          <mc:Choice Requires="wps">
+            <w:drawing>
+              <wp:anchor distT="0" distB="0" distL="114300" distR="114300" simplePos="0" relativeHeight="251666432" behindDoc="0" locked="0" layoutInCell="1" allowOverlap="1">
+                <wp:simplePos x="0" y="0"/>
+                <wp:positionH relativeFrom="column">
+                  <wp:posOffset>1289685</wp:posOffset>
+                </wp:positionH>
+                <wp:positionV relativeFrom="paragraph">
+                  <wp:posOffset>154940</wp:posOffset>
+                </wp:positionV>
+                <wp:extent cx="1282700" cy="1029335"/>
+                <wp:effectExtent l="0" t="0" r="69850" b="56515"/>
+                <wp:wrapNone/>
+                <wp:docPr id="51" name="Conector de Seta Reta 51"/>
+                <wp:cNvGraphicFramePr/>
+                <a:graphic xmlns:a="http://schemas.openxmlformats.org/drawingml/2006/main">
+                  <a:graphicData uri="http://schemas.microsoft.com/office/word/2010/wordprocessingShape">
+                    <wps:wsp>
+                      <wps:cNvCnPr/>
+                      <wps:spPr>
+                        <a:xfrm>
+                          <a:off x="0" y="0"/>
+                          <a:ext cx="1282700" cy="1029335"/>
+                        </a:xfrm>
+                        <a:prstGeom prst="straightConnector1">
+                          <a:avLst/>
+                        </a:prstGeom>
+                        <a:ln>
+                          <a:tailEnd type="triangle"/>
+                        </a:ln>
+                      </wps:spPr>
+                      <wps:style>
+                        <a:lnRef idx="1">
+                          <a:schemeClr val="accent1"/>
+                        </a:lnRef>
+                        <a:fillRef idx="0">
+                          <a:schemeClr val="accent1"/>
+                        </a:fillRef>
+                        <a:effectRef idx="0">
+                          <a:schemeClr val="accent1"/>
+                        </a:effectRef>
+                        <a:fontRef idx="minor">
+                          <a:schemeClr val="tx1"/>
+                        </a:fontRef>
+                      </wps:style>
+                      <wps:bodyPr/>
+                    </wps:wsp>
+                  </a:graphicData>
+                </a:graphic>
+                <wp14:sizeRelH relativeFrom="margin">
+                  <wp14:pctWidth>0</wp14:pctWidth>
+                </wp14:sizeRelH>
+                <wp14:sizeRelV relativeFrom="margin">
+                  <wp14:pctHeight>0</wp14:pctHeight>
+                </wp14:sizeRelV>
+              </wp:anchor>
+            </w:drawing>
+          </mc:Choice>
+          <mc:Fallback>
+            <w:pict>
+              <v:shape w14:anchorId="1BAA5ABF" id="Conector de Seta Reta 51" o:spid="_x0000_s1026" type="#_x0000_t32" style="position:absolute;margin-left:101.55pt;margin-top:12.2pt;width:101pt;height:81.05pt;z-index:251666432;visibility:visible;mso-wrap-style:square;mso-width-percent:0;mso-height-percent:0;mso-wrap-distance-left:9pt;mso-wrap-distance-top:0;mso-wrap-distance-right:9pt;mso-wrap-distance-bottom:0;mso-position-horizontal:absolute;mso-position-horizontal-relative:text;mso-position-vertical:absolute;mso-position-vertical-relative:text;mso-width-percent:0;mso-height-percent:0;mso-width-relative:margin;mso-height-relative:margin" o:gfxdata="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" strokecolor="#4472c4 [3204]" strokeweight=".5pt">
+                <v:stroke endarrow="block" joinstyle="miter"/>
+              </v:shape>
+            </w:pict>
+          </mc:Fallback>
+        </mc:AlternateContent>
+      </w:r>
+      <w:r>
+        <w:rPr>
+          <w:sz w:val="24"/>
+          <w:szCs w:val="24"/>
+        </w:rPr>
+        <w:t xml:space="preserve">30- </w:t>
+      </w:r>
+      <w:r>
+        <w:rPr>
+          <w:sz w:val="24"/>
+          <w:szCs w:val="24"/>
+        </w:rPr>
+        <w:t>Centralizamos o subtítulo d</w:t>
+      </w:r>
+      <w:r>
+        <w:rPr>
+          <w:sz w:val="24"/>
+          <w:szCs w:val="24"/>
+        </w:rPr>
+        <w:t>os</w:t>
+      </w:r>
+      <w:r>
+        <w:rPr>
+          <w:sz w:val="24"/>
+          <w:szCs w:val="24"/>
+        </w:rPr>
+        <w:t xml:space="preserve"> ite</w:t>
+      </w:r>
+      <w:r>
+        <w:rPr>
+          <w:sz w:val="24"/>
+          <w:szCs w:val="24"/>
+        </w:rPr>
+        <w:t>ns</w:t>
+      </w:r>
+      <w:r>
+        <w:rPr>
+          <w:sz w:val="24"/>
+          <w:szCs w:val="24"/>
+        </w:rPr>
+        <w:t xml:space="preserve"> da lista</w:t>
+      </w:r>
+      <w:r>
+        <w:rPr>
+          <w:sz w:val="24"/>
+          <w:szCs w:val="24"/>
+        </w:rPr>
+        <w:t>,</w:t>
+      </w:r>
+      <w:r>
+        <w:rPr>
+          <w:sz w:val="24"/>
+          <w:szCs w:val="24"/>
+        </w:rPr>
+        <w:t xml:space="preserve"> e definimos que cada item</w:t>
+      </w:r>
+      <w:r>
+        <w:rPr>
+          <w:sz w:val="24"/>
+          <w:szCs w:val="24"/>
+        </w:rPr>
+        <w:t>,</w:t>
+      </w:r>
+      <w:r>
+        <w:rPr>
+          <w:sz w:val="24"/>
+          <w:szCs w:val="24"/>
+        </w:rPr>
+        <w:t xml:space="preserve"> possuem 30% de largura.</w:t>
+      </w:r>
+    </w:p>
+    <w:p>
+      <w:pPr>
+        <w:pStyle w:val="PargrafodaLista"/>
+        <w:tabs>
+          <w:tab w:val="left" w:pos="1275"/>
+        </w:tabs>
+        <w:rPr>
+          <w:sz w:val="24"/>
+          <w:szCs w:val="24"/>
+        </w:rPr>
+      </w:pPr>
+    </w:p>
+    <w:p>
+      <w:pPr>
+        <w:pStyle w:val="PargrafodaLista"/>
+        <w:tabs>
+          <w:tab w:val="left" w:pos="1275"/>
+        </w:tabs>
+        <w:rPr>
+          <w:sz w:val="24"/>
+          <w:szCs w:val="24"/>
+        </w:rPr>
+      </w:pPr>
+      <w:r>
+        <w:rPr>
+          <w:sz w:val="24"/>
+          <w:szCs w:val="24"/>
+        </w:rPr>
+        <w:drawing>
+          <wp:inline distT="0" distB="0" distL="0" distR="0" wp14:anchorId="5E9B5891" wp14:editId="3A13E48E">
+            <wp:extent cx="4096322" cy="1752845"/>
+            <wp:effectExtent l="0" t="0" r="0" b="0"/>
+            <wp:docPr id="50" name="Imagem 50"/>
+            <wp:cNvGraphicFramePr>
+              <a:graphicFrameLocks xmlns:a="http://schemas.openxmlformats.org/drawingml/2006/main" noChangeAspect="1"/>
+            </wp:cNvGraphicFramePr>
+            <a:graphic xmlns:a="http://schemas.openxmlformats.org/drawingml/2006/main">
+              <a:graphicData uri="http://schemas.openxmlformats.org/drawingml/2006/picture">
+                <pic:pic xmlns:pic="http://schemas.openxmlformats.org/drawingml/2006/picture">
+                  <pic:nvPicPr>
+                    <pic:cNvPr id="1" name=""/>
+                    <pic:cNvPicPr/>
+                  </pic:nvPicPr>
+                  <pic:blipFill>
+                    <a:blip r:embed="rId50"/>
+                    <a:stretch>
+                      <a:fillRect/>
+                    </a:stretch>
+                  </pic:blipFill>
+                  <pic:spPr>
+                    <a:xfrm>
+                      <a:off x="0" y="0"/>
+                      <a:ext cx="4096322" cy="1752845"/>
+                    </a:xfrm>
+                    <a:prstGeom prst="rect">
+                      <a:avLst/>
+                    </a:prstGeom>
+                  </pic:spPr>
+                </pic:pic>
+              </a:graphicData>
+            </a:graphic>
+          </wp:inline>
+        </w:drawing>
+      </w:r>
+    </w:p>
+    <w:p>
+      <w:pPr>
+        <w:pStyle w:val="PargrafodaLista"/>
+        <w:tabs>
+          <w:tab w:val="left" w:pos="1275"/>
+        </w:tabs>
+        <w:rPr>
+          <w:sz w:val="24"/>
+          <w:szCs w:val="24"/>
+        </w:rPr>
+      </w:pPr>
+    </w:p>
+    <w:p>
+      <w:pPr>
+        <w:pStyle w:val="PargrafodaLista"/>
+        <w:tabs>
+          <w:tab w:val="left" w:pos="1275"/>
+        </w:tabs>
+        <w:rPr>
+          <w:sz w:val="24"/>
+          <w:szCs w:val="24"/>
+        </w:rPr>
+      </w:pPr>
+      <w:r>
+        <w:rPr>
+          <w:noProof/>
+          <w:sz w:val="24"/>
+          <w:szCs w:val="24"/>
+        </w:rPr>
+        <mc:AlternateContent>
+          <mc:Choice Requires="wps">
+            <w:drawing>
+              <wp:anchor distT="0" distB="0" distL="114300" distR="114300" simplePos="0" relativeHeight="251668480" behindDoc="0" locked="0" layoutInCell="1" allowOverlap="1">
+                <wp:simplePos x="0" y="0"/>
+                <wp:positionH relativeFrom="column">
+                  <wp:posOffset>3378067</wp:posOffset>
+                </wp:positionH>
+                <wp:positionV relativeFrom="paragraph">
+                  <wp:posOffset>170046</wp:posOffset>
+                </wp:positionV>
+                <wp:extent cx="1542197" cy="1433015"/>
+                <wp:effectExtent l="38100" t="0" r="20320" b="53340"/>
+                <wp:wrapNone/>
+                <wp:docPr id="54" name="Conector de Seta Reta 54"/>
+                <wp:cNvGraphicFramePr/>
+                <a:graphic xmlns:a="http://schemas.openxmlformats.org/drawingml/2006/main">
+                  <a:graphicData uri="http://schemas.microsoft.com/office/word/2010/wordprocessingShape">
+                    <wps:wsp>
+                      <wps:cNvCnPr/>
+                      <wps:spPr>
+                        <a:xfrm flipH="1">
+                          <a:off x="0" y="0"/>
+                          <a:ext cx="1542197" cy="1433015"/>
+                        </a:xfrm>
+                        <a:prstGeom prst="straightConnector1">
+                          <a:avLst/>
+                        </a:prstGeom>
+                        <a:ln>
+                          <a:tailEnd type="triangle"/>
+                        </a:ln>
+                      </wps:spPr>
+                      <wps:style>
+                        <a:lnRef idx="1">
+                          <a:schemeClr val="accent1"/>
+                        </a:lnRef>
+                        <a:fillRef idx="0">
+                          <a:schemeClr val="accent1"/>
+                        </a:fillRef>
+                        <a:effectRef idx="0">
+                          <a:schemeClr val="accent1"/>
+                        </a:effectRef>
+                        <a:fontRef idx="minor">
+                          <a:schemeClr val="tx1"/>
+                        </a:fontRef>
+                      </wps:style>
+                      <wps:bodyPr/>
+                    </wps:wsp>
+                  </a:graphicData>
+                </a:graphic>
+              </wp:anchor>
+            </w:drawing>
+          </mc:Choice>
+          <mc:Fallback>
+            <w:pict>
+              <v:shape w14:anchorId="3CD4913B" id="Conector de Seta Reta 54" o:spid="_x0000_s1026" type="#_x0000_t32" style="position:absolute;margin-left:266pt;margin-top:13.4pt;width:121.45pt;height:112.85pt;flip:x;z-index:251668480;visibility:visible;mso-wrap-style:square;mso-wrap-distance-left:9pt;mso-wrap-distance-top:0;mso-wrap-distance-right:9pt;mso-wrap-distance-bottom:0;mso-position-horizontal:absolute;mso-position-horizontal-relative:text;mso-position-vertical:absolute;mso-position-vertical-relative:text" o:gfxdata="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" strokecolor="#4472c4 [3204]" strokeweight=".5pt">
+                <v:stroke endarrow="block" joinstyle="miter"/>
+              </v:shape>
+            </w:pict>
+          </mc:Fallback>
+        </mc:AlternateContent>
+      </w:r>
+      <w:r>
+        <w:rPr>
+          <w:sz w:val="24"/>
+          <w:szCs w:val="24"/>
+        </w:rPr>
+        <w:t xml:space="preserve">31- Para alinhar o texto na parte superior utilizamos o </w:t>
+      </w:r>
+      <w:proofErr w:type="spellStart"/>
+      <w:r>
+        <w:rPr>
+          <w:sz w:val="24"/>
+          <w:szCs w:val="24"/>
+        </w:rPr>
+        <w:t>vertical</w:t>
+      </w:r>
+      <w:r>
+        <w:rPr>
+          <w:sz w:val="24"/>
+          <w:szCs w:val="24"/>
+        </w:rPr>
+        <w:t>-align:top</w:t>
+      </w:r>
+      <w:proofErr w:type="spellEnd"/>
+      <w:r>
+        <w:rPr>
+          <w:sz w:val="24"/>
+          <w:szCs w:val="24"/>
+        </w:rPr>
+        <w:t>;</w:t>
+      </w:r>
+    </w:p>
+    <w:p>
+      <w:pPr>
+        <w:pStyle w:val="PargrafodaLista"/>
+        <w:tabs>
+          <w:tab w:val="left" w:pos="1275"/>
+        </w:tabs>
+        <w:rPr>
+          <w:sz w:val="24"/>
+          <w:szCs w:val="24"/>
+        </w:rPr>
+      </w:pPr>
+    </w:p>
+    <w:p>
+      <w:pPr>
+        <w:pStyle w:val="PargrafodaLista"/>
+        <w:tabs>
+          <w:tab w:val="left" w:pos="1275"/>
+        </w:tabs>
+        <w:rPr>
+          <w:sz w:val="24"/>
+          <w:szCs w:val="24"/>
+        </w:rPr>
+      </w:pPr>
+      <w:r>
+        <w:rPr>
+          <w:noProof/>
+          <w:sz w:val="24"/>
+          <w:szCs w:val="24"/>
+        </w:rPr>
+        <mc:AlternateContent>
+          <mc:Choice Requires="wps">
+            <w:drawing>
+              <wp:anchor distT="0" distB="0" distL="114300" distR="114300" simplePos="0" relativeHeight="251669504" behindDoc="0" locked="0" layoutInCell="1" allowOverlap="1">
+                <wp:simplePos x="0" y="0"/>
+                <wp:positionH relativeFrom="column">
+                  <wp:posOffset>3405363</wp:posOffset>
+                </wp:positionH>
+                <wp:positionV relativeFrom="paragraph">
+                  <wp:posOffset>1008446</wp:posOffset>
+                </wp:positionV>
+                <wp:extent cx="1453486" cy="375314"/>
+                <wp:effectExtent l="0" t="57150" r="0" b="24765"/>
+                <wp:wrapNone/>
+                <wp:docPr id="56" name="Conector de Seta Reta 56"/>
+                <wp:cNvGraphicFramePr/>
+                <a:graphic xmlns:a="http://schemas.openxmlformats.org/drawingml/2006/main">
+                  <a:graphicData uri="http://schemas.microsoft.com/office/word/2010/wordprocessingShape">
+                    <wps:wsp>
+                      <wps:cNvCnPr/>
+                      <wps:spPr>
+                        <a:xfrm flipV="1">
+                          <a:off x="0" y="0"/>
+                          <a:ext cx="1453486" cy="375314"/>
+                        </a:xfrm>
+                        <a:prstGeom prst="straightConnector1">
+                          <a:avLst/>
+                        </a:prstGeom>
+                        <a:ln>
+                          <a:tailEnd type="triangle"/>
+                        </a:ln>
+                      </wps:spPr>
+                      <wps:style>
+                        <a:lnRef idx="1">
+                          <a:schemeClr val="accent1"/>
+                        </a:lnRef>
+                        <a:fillRef idx="0">
+                          <a:schemeClr val="accent1"/>
+                        </a:fillRef>
+                        <a:effectRef idx="0">
+                          <a:schemeClr val="accent1"/>
+                        </a:effectRef>
+                        <a:fontRef idx="minor">
+                          <a:schemeClr val="tx1"/>
+                        </a:fontRef>
+                      </wps:style>
+                      <wps:bodyPr/>
+                    </wps:wsp>
+                  </a:graphicData>
+                </a:graphic>
+              </wp:anchor>
+            </w:drawing>
+          </mc:Choice>
+          <mc:Fallback>
+            <w:pict>
+              <v:shape w14:anchorId="0ECE0A2B" id="Conector de Seta Reta 56" o:spid="_x0000_s1026" type="#_x0000_t32" style="position:absolute;margin-left:268.15pt;margin-top:79.4pt;width:114.45pt;height:29.55pt;flip:y;z-index:251669504;visibility:visible;mso-wrap-style:square;mso-wrap-distance-left:9pt;mso-wrap-distance-top:0;mso-wrap-distance-right:9pt;mso-wrap-distance-bottom:0;mso-position-horizontal:absolute;mso-position-horizontal-relative:text;mso-position-vertical:absolute;mso-position-vertical-relative:text" o:gfxdata="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" strokecolor="#4472c4 [3204]" strokeweight=".5pt">
+                <v:stroke endarrow="block" joinstyle="miter"/>
+              </v:shape>
+            </w:pict>
+          </mc:Fallback>
+        </mc:AlternateContent>
+      </w:r>
+      <w:r>
+        <w:rPr>
+          <w:sz w:val="24"/>
+          <w:szCs w:val="24"/>
+        </w:rPr>
+        <w:drawing>
+          <wp:inline distT="0" distB="0" distL="0" distR="0" wp14:anchorId="593CD1F4" wp14:editId="3C6AE6DA">
+            <wp:extent cx="3791479" cy="2076740"/>
+            <wp:effectExtent l="0" t="0" r="0" b="0"/>
+            <wp:docPr id="53" name="Imagem 53"/>
+            <wp:cNvGraphicFramePr>
+              <a:graphicFrameLocks xmlns:a="http://schemas.openxmlformats.org/drawingml/2006/main" noChangeAspect="1"/>
+            </wp:cNvGraphicFramePr>
+            <a:graphic xmlns:a="http://schemas.openxmlformats.org/drawingml/2006/main">
+              <a:graphicData uri="http://schemas.openxmlformats.org/drawingml/2006/picture">
+                <pic:pic xmlns:pic="http://schemas.openxmlformats.org/drawingml/2006/picture">
+                  <pic:nvPicPr>
+                    <pic:cNvPr id="1" name=""/>
+                    <pic:cNvPicPr/>
+                  </pic:nvPicPr>
+                  <pic:blipFill>
+                    <a:blip r:embed="rId51"/>
+                    <a:stretch>
+                      <a:fillRect/>
+                    </a:stretch>
+                  </pic:blipFill>
+                  <pic:spPr>
+                    <a:xfrm>
+                      <a:off x="0" y="0"/>
+                      <a:ext cx="3791479" cy="2076740"/>
+                    </a:xfrm>
+                    <a:prstGeom prst="rect">
+                      <a:avLst/>
+                    </a:prstGeom>
+                  </pic:spPr>
+                </pic:pic>
+              </a:graphicData>
+            </a:graphic>
+          </wp:inline>
+        </w:drawing>
+      </w:r>
+      <w:r>
+        <w:rPr>
+          <w:sz w:val="24"/>
+          <w:szCs w:val="24"/>
+        </w:rPr>
+        <w:drawing>
+          <wp:inline distT="0" distB="0" distL="0" distR="0" wp14:anchorId="1B283F2F" wp14:editId="720CA8F7">
+            <wp:extent cx="3396426" cy="1294851"/>
+            <wp:effectExtent l="0" t="0" r="0" b="635"/>
+            <wp:docPr id="55" name="Imagem 55"/>
+            <wp:cNvGraphicFramePr>
+              <a:graphicFrameLocks xmlns:a="http://schemas.openxmlformats.org/drawingml/2006/main" noChangeAspect="1"/>
+            </wp:cNvGraphicFramePr>
+            <a:graphic xmlns:a="http://schemas.openxmlformats.org/drawingml/2006/main">
+              <a:graphicData uri="http://schemas.openxmlformats.org/drawingml/2006/picture">
+                <pic:pic xmlns:pic="http://schemas.openxmlformats.org/drawingml/2006/picture">
+                  <pic:nvPicPr>
+                    <pic:cNvPr id="1" name=""/>
+                    <pic:cNvPicPr/>
+                  </pic:nvPicPr>
+                  <pic:blipFill>
+                    <a:blip r:embed="rId52"/>
+                    <a:stretch>
+                      <a:fillRect/>
+                    </a:stretch>
+                  </pic:blipFill>
+                  <pic:spPr>
+                    <a:xfrm>
+                      <a:off x="0" y="0"/>
+                      <a:ext cx="3445729" cy="1313647"/>
+                    </a:xfrm>
+                    <a:prstGeom prst="rect">
+                      <a:avLst/>
+                    </a:prstGeom>
+                  </pic:spPr>
+                </pic:pic>
+              </a:graphicData>
+            </a:graphic>
+          </wp:inline>
+        </w:drawing>
+      </w:r>
+    </w:p>
+    <w:p>
+      <w:pPr>
+        <w:pStyle w:val="PargrafodaLista"/>
+        <w:tabs>
+          <w:tab w:val="left" w:pos="1275"/>
+        </w:tabs>
+        <w:rPr>
+          <w:sz w:val="24"/>
+          <w:szCs w:val="24"/>
+        </w:rPr>
+      </w:pPr>
+      <w:r>
+        <w:rPr>
+          <w:sz w:val="24"/>
+          <w:szCs w:val="24"/>
+        </w:rPr>
+        <w:t xml:space="preserve"> </w:t>
+      </w:r>
+      <w:r>
+        <w:rPr>
+          <w:sz w:val="24"/>
+          <w:szCs w:val="24"/>
+        </w:rPr>
+        <w:tab/>
+      </w:r>
+    </w:p>
+    <w:p>
+      <w:pPr>
+        <w:pStyle w:val="PargrafodaLista"/>
+        <w:tabs>
+          <w:tab w:val="left" w:pos="1275"/>
+        </w:tabs>
+        <w:rPr>
+          <w:sz w:val="24"/>
+          <w:szCs w:val="24"/>
+        </w:rPr>
+      </w:pPr>
+      <w:r>
+        <w:rPr>
+          <w:sz w:val="24"/>
+          <w:szCs w:val="24"/>
+        </w:rPr>
+        <w:t xml:space="preserve">32 – </w:t>
+      </w:r>
+      <w:r>
+        <w:rPr>
+          <w:sz w:val="24"/>
+          <w:szCs w:val="24"/>
+        </w:rPr>
+        <w:t>Nos subtítulos</w:t>
+      </w:r>
+      <w:r>
+        <w:rPr>
+          <w:sz w:val="24"/>
+          <w:szCs w:val="24"/>
+        </w:rPr>
+        <w:t xml:space="preserve"> de cada item aumentamos o tamanho da fonte e deixamos ela mais encorpada </w:t>
+      </w:r>
+      <w:r>
+        <w:rPr>
+          <w:sz w:val="24"/>
+          <w:szCs w:val="24"/>
+        </w:rPr>
+        <w:t>e negrito.</w:t>
+      </w:r>
+    </w:p>
+    <w:p>
+      <w:pPr>
+        <w:pStyle w:val="PargrafodaLista"/>
+        <w:tabs>
+          <w:tab w:val="left" w:pos="1275"/>
+        </w:tabs>
+        <w:rPr>
+          <w:sz w:val="24"/>
+          <w:szCs w:val="24"/>
+        </w:rPr>
+      </w:pPr>
+      <w:r>
+        <w:rPr>
+          <w:sz w:val="24"/>
+          <w:szCs w:val="24"/>
+        </w:rPr>
+        <w:drawing>
+          <wp:inline distT="0" distB="0" distL="0" distR="0" wp14:anchorId="490389CD" wp14:editId="10C955AF">
+            <wp:extent cx="3400900" cy="1638529"/>
+            <wp:effectExtent l="0" t="0" r="9525" b="0"/>
+            <wp:docPr id="57" name="Imagem 57"/>
+            <wp:cNvGraphicFramePr>
+              <a:graphicFrameLocks xmlns:a="http://schemas.openxmlformats.org/drawingml/2006/main" noChangeAspect="1"/>
+            </wp:cNvGraphicFramePr>
+            <a:graphic xmlns:a="http://schemas.openxmlformats.org/drawingml/2006/main">
+              <a:graphicData uri="http://schemas.openxmlformats.org/drawingml/2006/picture">
+                <pic:pic xmlns:pic="http://schemas.openxmlformats.org/drawingml/2006/picture">
+                  <pic:nvPicPr>
+                    <pic:cNvPr id="1" name=""/>
+                    <pic:cNvPicPr/>
+                  </pic:nvPicPr>
+                  <pic:blipFill>
+                    <a:blip r:embed="rId53"/>
+                    <a:stretch>
+                      <a:fillRect/>
+                    </a:stretch>
+                  </pic:blipFill>
+                  <pic:spPr>
+                    <a:xfrm>
+                      <a:off x="0" y="0"/>
+                      <a:ext cx="3400900" cy="1638529"/>
+                    </a:xfrm>
+                    <a:prstGeom prst="rect">
+                      <a:avLst/>
+                    </a:prstGeom>
+                  </pic:spPr>
+                </pic:pic>
+              </a:graphicData>
+            </a:graphic>
+          </wp:inline>
+        </w:drawing>
+      </w:r>
+      <w:bookmarkStart w:id="0" w:name="_GoBack"/>
       <w:bookmarkEnd w:id="0"/>
-      <w:r>
-        <w:rPr>
-          <w:sz w:val="24"/>
-          <w:szCs w:val="24"/>
-        </w:rPr>
-        <w:br w:type="page"/>
-      </w:r>
-    </w:p>
-    <w:p>
-      <w:pPr>
-        <w:pStyle w:val="PargrafodaLista"/>
-        <w:tabs>
-          <w:tab w:val="left" w:pos="1275"/>
-        </w:tabs>
-        <w:rPr>
-          <w:sz w:val="24"/>
-          <w:szCs w:val="24"/>
-        </w:rPr>
-      </w:pPr>
     </w:p>
     <w:sectPr>
       <w:pgSz w:w="11906" w:h="16838"/>

</xml_diff>

<commit_message>
atualização da aula dia 29/06/2026
</commit_message>
<xml_diff>
--- a/apostila/Apostila Space For Men.docx
+++ b/apostila/Apostila Space For Men.docx
@@ -11599,6 +11599,7 @@
       </w:pPr>
       <w:r>
         <w:rPr>
+          <w:noProof/>
           <w:sz w:val="24"/>
           <w:szCs w:val="24"/>
         </w:rPr>
@@ -12213,58 +12214,57 @@
         </w:rPr>
         <w:t xml:space="preserve"> para aumentar o tamanho do botão e ter a rotação.</w:t>
       </w:r>
-      <w:bookmarkStart w:id="0" w:name="_GoBack"/>
-      <w:bookmarkEnd w:id="0"/>
-    </w:p>
-    <w:p>
-      <w:pPr>
-        <w:pStyle w:val="PargrafodaLista"/>
-        <w:tabs>
-          <w:tab w:val="left" w:pos="1275"/>
-        </w:tabs>
-        <w:rPr>
-          <w:sz w:val="24"/>
-          <w:szCs w:val="24"/>
-        </w:rPr>
-      </w:pPr>
-    </w:p>
-    <w:p>
-      <w:pPr>
-        <w:pStyle w:val="PargrafodaLista"/>
-        <w:tabs>
-          <w:tab w:val="left" w:pos="1275"/>
-        </w:tabs>
-        <w:rPr>
-          <w:sz w:val="24"/>
-          <w:szCs w:val="24"/>
-        </w:rPr>
-      </w:pPr>
-    </w:p>
-    <w:p>
-      <w:pPr>
-        <w:pStyle w:val="PargrafodaLista"/>
-        <w:tabs>
-          <w:tab w:val="left" w:pos="1275"/>
-        </w:tabs>
-        <w:rPr>
-          <w:sz w:val="24"/>
-          <w:szCs w:val="24"/>
-        </w:rPr>
-      </w:pPr>
-    </w:p>
-    <w:p>
-      <w:pPr>
-        <w:pStyle w:val="PargrafodaLista"/>
-        <w:tabs>
-          <w:tab w:val="left" w:pos="1275"/>
-        </w:tabs>
-        <w:rPr>
-          <w:sz w:val="24"/>
-          <w:szCs w:val="24"/>
-        </w:rPr>
-      </w:pPr>
-      <w:r>
-        <w:rPr>
+    </w:p>
+    <w:p>
+      <w:pPr>
+        <w:pStyle w:val="PargrafodaLista"/>
+        <w:tabs>
+          <w:tab w:val="left" w:pos="1275"/>
+        </w:tabs>
+        <w:rPr>
+          <w:sz w:val="24"/>
+          <w:szCs w:val="24"/>
+        </w:rPr>
+      </w:pPr>
+    </w:p>
+    <w:p>
+      <w:pPr>
+        <w:pStyle w:val="PargrafodaLista"/>
+        <w:tabs>
+          <w:tab w:val="left" w:pos="1275"/>
+        </w:tabs>
+        <w:rPr>
+          <w:sz w:val="24"/>
+          <w:szCs w:val="24"/>
+        </w:rPr>
+      </w:pPr>
+    </w:p>
+    <w:p>
+      <w:pPr>
+        <w:pStyle w:val="PargrafodaLista"/>
+        <w:tabs>
+          <w:tab w:val="left" w:pos="1275"/>
+        </w:tabs>
+        <w:rPr>
+          <w:sz w:val="24"/>
+          <w:szCs w:val="24"/>
+        </w:rPr>
+      </w:pPr>
+    </w:p>
+    <w:p>
+      <w:pPr>
+        <w:pStyle w:val="PargrafodaLista"/>
+        <w:tabs>
+          <w:tab w:val="left" w:pos="1275"/>
+        </w:tabs>
+        <w:rPr>
+          <w:sz w:val="24"/>
+          <w:szCs w:val="24"/>
+        </w:rPr>
+      </w:pPr>
+      <w:r>
+        <w:rPr>
+          <w:noProof/>
           <w:sz w:val="24"/>
           <w:szCs w:val="24"/>
         </w:rPr>
@@ -12304,6 +12304,719 @@
           </wp:inline>
         </w:drawing>
       </w:r>
+    </w:p>
+    <w:p>
+      <w:pPr>
+        <w:pStyle w:val="PargrafodaLista"/>
+        <w:tabs>
+          <w:tab w:val="left" w:pos="1275"/>
+        </w:tabs>
+        <w:rPr>
+          <w:sz w:val="24"/>
+          <w:szCs w:val="24"/>
+        </w:rPr>
+      </w:pPr>
+    </w:p>
+    <w:p>
+      <w:pPr>
+        <w:pStyle w:val="PargrafodaLista"/>
+        <w:tabs>
+          <w:tab w:val="left" w:pos="1275"/>
+        </w:tabs>
+        <w:rPr>
+          <w:sz w:val="24"/>
+          <w:szCs w:val="24"/>
+        </w:rPr>
+      </w:pPr>
+      <w:r>
+        <w:rPr>
+          <w:sz w:val="24"/>
+          <w:szCs w:val="24"/>
+        </w:rPr>
+        <w:t xml:space="preserve">57 – Logo abaixo do forme criamos a estrutura da tabela </w:t>
+      </w:r>
+      <w:r>
+        <w:rPr>
+          <w:sz w:val="24"/>
+          <w:szCs w:val="24"/>
+        </w:rPr>
+        <w:t>conforme código:</w:t>
+      </w:r>
+    </w:p>
+    <w:p>
+      <w:pPr>
+        <w:pStyle w:val="PargrafodaLista"/>
+        <w:tabs>
+          <w:tab w:val="left" w:pos="1275"/>
+        </w:tabs>
+        <w:rPr>
+          <w:sz w:val="24"/>
+          <w:szCs w:val="24"/>
+        </w:rPr>
+      </w:pPr>
+    </w:p>
+    <w:p>
+      <w:pPr>
+        <w:pStyle w:val="PargrafodaLista"/>
+        <w:tabs>
+          <w:tab w:val="left" w:pos="1275"/>
+        </w:tabs>
+        <w:rPr>
+          <w:sz w:val="24"/>
+          <w:szCs w:val="24"/>
+        </w:rPr>
+      </w:pPr>
+      <w:r>
+        <w:rPr>
+          <w:sz w:val="24"/>
+          <w:szCs w:val="24"/>
+        </w:rPr>
+        <w:drawing>
+          <wp:inline distT="0" distB="0" distL="0" distR="0" wp14:anchorId="4D6DD179" wp14:editId="556CE42B">
+            <wp:extent cx="2562583" cy="3972479"/>
+            <wp:effectExtent l="0" t="0" r="9525" b="0"/>
+            <wp:docPr id="113" name="Imagem 113"/>
+            <wp:cNvGraphicFramePr>
+              <a:graphicFrameLocks xmlns:a="http://schemas.openxmlformats.org/drawingml/2006/main" noChangeAspect="1"/>
+            </wp:cNvGraphicFramePr>
+            <a:graphic xmlns:a="http://schemas.openxmlformats.org/drawingml/2006/main">
+              <a:graphicData uri="http://schemas.openxmlformats.org/drawingml/2006/picture">
+                <pic:pic xmlns:pic="http://schemas.openxmlformats.org/drawingml/2006/picture">
+                  <pic:nvPicPr>
+                    <pic:cNvPr id="1" name=""/>
+                    <pic:cNvPicPr/>
+                  </pic:nvPicPr>
+                  <pic:blipFill>
+                    <a:blip r:embed="rId91"/>
+                    <a:stretch>
+                      <a:fillRect/>
+                    </a:stretch>
+                  </pic:blipFill>
+                  <pic:spPr>
+                    <a:xfrm>
+                      <a:off x="0" y="0"/>
+                      <a:ext cx="2562583" cy="3972479"/>
+                    </a:xfrm>
+                    <a:prstGeom prst="rect">
+                      <a:avLst/>
+                    </a:prstGeom>
+                  </pic:spPr>
+                </pic:pic>
+              </a:graphicData>
+            </a:graphic>
+          </wp:inline>
+        </w:drawing>
+      </w:r>
+    </w:p>
+    <w:p>
+      <w:pPr>
+        <w:pStyle w:val="PargrafodaLista"/>
+        <w:tabs>
+          <w:tab w:val="left" w:pos="1275"/>
+        </w:tabs>
+        <w:rPr>
+          <w:sz w:val="24"/>
+          <w:szCs w:val="24"/>
+        </w:rPr>
+      </w:pPr>
+    </w:p>
+    <w:p>
+      <w:pPr>
+        <w:pStyle w:val="PargrafodaLista"/>
+        <w:tabs>
+          <w:tab w:val="left" w:pos="1275"/>
+        </w:tabs>
+        <w:rPr>
+          <w:sz w:val="24"/>
+          <w:szCs w:val="24"/>
+        </w:rPr>
+      </w:pPr>
+      <w:r>
+        <w:rPr>
+          <w:sz w:val="24"/>
+          <w:szCs w:val="24"/>
+        </w:rPr>
+        <w:t xml:space="preserve">58 </w:t>
+      </w:r>
+      <w:r>
+        <w:rPr>
+          <w:sz w:val="24"/>
+          <w:szCs w:val="24"/>
+        </w:rPr>
+        <w:t>–</w:t>
+      </w:r>
+      <w:r>
+        <w:rPr>
+          <w:sz w:val="24"/>
+          <w:szCs w:val="24"/>
+        </w:rPr>
+        <w:t xml:space="preserve"> </w:t>
+      </w:r>
+      <w:r>
+        <w:rPr>
+          <w:sz w:val="24"/>
+          <w:szCs w:val="24"/>
+        </w:rPr>
+        <w:t xml:space="preserve">Trabalhando com a tabela estamos utilizando o </w:t>
+      </w:r>
+      <w:proofErr w:type="spellStart"/>
+      <w:r>
+        <w:rPr>
+          <w:sz w:val="24"/>
+          <w:szCs w:val="24"/>
+        </w:rPr>
+        <w:t>Thead</w:t>
+      </w:r>
+      <w:proofErr w:type="spellEnd"/>
+      <w:r>
+        <w:rPr>
+          <w:sz w:val="24"/>
+          <w:szCs w:val="24"/>
+        </w:rPr>
+        <w:t xml:space="preserve"> (cabeçalho da tabela) e o </w:t>
+      </w:r>
+      <w:proofErr w:type="spellStart"/>
+      <w:r>
+        <w:rPr>
+          <w:sz w:val="24"/>
+          <w:szCs w:val="24"/>
+        </w:rPr>
+        <w:t>tbody</w:t>
+      </w:r>
+      <w:proofErr w:type="spellEnd"/>
+      <w:r>
+        <w:rPr>
+          <w:sz w:val="24"/>
+          <w:szCs w:val="24"/>
+        </w:rPr>
+        <w:t xml:space="preserve">(corpo da tabela) e dentro do </w:t>
+      </w:r>
+      <w:proofErr w:type="spellStart"/>
+      <w:r>
+        <w:rPr>
+          <w:sz w:val="24"/>
+          <w:szCs w:val="24"/>
+        </w:rPr>
+        <w:t>thead</w:t>
+      </w:r>
+      <w:proofErr w:type="spellEnd"/>
+      <w:r>
+        <w:rPr>
+          <w:sz w:val="24"/>
+          <w:szCs w:val="24"/>
+        </w:rPr>
+        <w:t xml:space="preserve"> temos o </w:t>
+      </w:r>
+      <w:proofErr w:type="spellStart"/>
+      <w:r>
+        <w:rPr>
+          <w:sz w:val="24"/>
+          <w:szCs w:val="24"/>
+        </w:rPr>
+        <w:t>th</w:t>
+      </w:r>
+      <w:proofErr w:type="spellEnd"/>
+      <w:r>
+        <w:rPr>
+          <w:sz w:val="24"/>
+          <w:szCs w:val="24"/>
+        </w:rPr>
+        <w:t xml:space="preserve"> que são os dados do cabe</w:t>
+      </w:r>
+      <w:r>
+        <w:rPr>
+          <w:sz w:val="24"/>
+          <w:szCs w:val="24"/>
+        </w:rPr>
+        <w:t>çalho da tabela.</w:t>
+      </w:r>
+    </w:p>
+    <w:p>
+      <w:pPr>
+        <w:pStyle w:val="PargrafodaLista"/>
+        <w:tabs>
+          <w:tab w:val="left" w:pos="1275"/>
+        </w:tabs>
+        <w:rPr>
+          <w:sz w:val="24"/>
+          <w:szCs w:val="24"/>
+        </w:rPr>
+      </w:pPr>
+    </w:p>
+    <w:p>
+      <w:pPr>
+        <w:pStyle w:val="PargrafodaLista"/>
+        <w:tabs>
+          <w:tab w:val="left" w:pos="1275"/>
+        </w:tabs>
+        <w:rPr>
+          <w:sz w:val="24"/>
+          <w:szCs w:val="24"/>
+        </w:rPr>
+      </w:pPr>
+      <w:r>
+        <w:rPr>
+          <w:sz w:val="24"/>
+          <w:szCs w:val="24"/>
+        </w:rPr>
+        <w:drawing>
+          <wp:inline distT="0" distB="0" distL="0" distR="0" wp14:anchorId="2EC0BECE" wp14:editId="567260F7">
+            <wp:extent cx="4029637" cy="2581635"/>
+            <wp:effectExtent l="0" t="0" r="9525" b="9525"/>
+            <wp:docPr id="114" name="Imagem 114"/>
+            <wp:cNvGraphicFramePr>
+              <a:graphicFrameLocks xmlns:a="http://schemas.openxmlformats.org/drawingml/2006/main" noChangeAspect="1"/>
+            </wp:cNvGraphicFramePr>
+            <a:graphic xmlns:a="http://schemas.openxmlformats.org/drawingml/2006/main">
+              <a:graphicData uri="http://schemas.openxmlformats.org/drawingml/2006/picture">
+                <pic:pic xmlns:pic="http://schemas.openxmlformats.org/drawingml/2006/picture">
+                  <pic:nvPicPr>
+                    <pic:cNvPr id="1" name=""/>
+                    <pic:cNvPicPr/>
+                  </pic:nvPicPr>
+                  <pic:blipFill>
+                    <a:blip r:embed="rId92"/>
+                    <a:stretch>
+                      <a:fillRect/>
+                    </a:stretch>
+                  </pic:blipFill>
+                  <pic:spPr>
+                    <a:xfrm>
+                      <a:off x="0" y="0"/>
+                      <a:ext cx="4029637" cy="2581635"/>
+                    </a:xfrm>
+                    <a:prstGeom prst="rect">
+                      <a:avLst/>
+                    </a:prstGeom>
+                  </pic:spPr>
+                </pic:pic>
+              </a:graphicData>
+            </a:graphic>
+          </wp:inline>
+        </w:drawing>
+      </w:r>
+    </w:p>
+    <w:p>
+      <w:pPr>
+        <w:pStyle w:val="PargrafodaLista"/>
+        <w:tabs>
+          <w:tab w:val="left" w:pos="1275"/>
+        </w:tabs>
+        <w:rPr>
+          <w:sz w:val="24"/>
+          <w:szCs w:val="24"/>
+        </w:rPr>
+      </w:pPr>
+    </w:p>
+    <w:p>
+      <w:pPr>
+        <w:pStyle w:val="PargrafodaLista"/>
+        <w:tabs>
+          <w:tab w:val="left" w:pos="1275"/>
+        </w:tabs>
+        <w:rPr>
+          <w:sz w:val="24"/>
+          <w:szCs w:val="24"/>
+        </w:rPr>
+      </w:pPr>
+      <w:r>
+        <w:rPr>
+          <w:sz w:val="24"/>
+          <w:szCs w:val="24"/>
+        </w:rPr>
+        <w:t xml:space="preserve">59 – No </w:t>
+      </w:r>
+      <w:proofErr w:type="spellStart"/>
+      <w:r>
+        <w:rPr>
+          <w:sz w:val="24"/>
+          <w:szCs w:val="24"/>
+        </w:rPr>
+        <w:t>css</w:t>
+      </w:r>
+      <w:proofErr w:type="spellEnd"/>
+      <w:r>
+        <w:rPr>
+          <w:sz w:val="24"/>
+          <w:szCs w:val="24"/>
+        </w:rPr>
+        <w:t xml:space="preserve"> da tabela vamos dar um espaço externo para cima e para baixo.</w:t>
+      </w:r>
+    </w:p>
+    <w:p>
+      <w:pPr>
+        <w:pStyle w:val="PargrafodaLista"/>
+        <w:tabs>
+          <w:tab w:val="left" w:pos="1275"/>
+        </w:tabs>
+        <w:rPr>
+          <w:sz w:val="24"/>
+          <w:szCs w:val="24"/>
+        </w:rPr>
+      </w:pPr>
+      <w:r>
+        <w:rPr>
+          <w:sz w:val="24"/>
+          <w:szCs w:val="24"/>
+        </w:rPr>
+        <w:drawing>
+          <wp:inline distT="0" distB="0" distL="0" distR="0" wp14:anchorId="662228C4" wp14:editId="790DA9AF">
+            <wp:extent cx="3600953" cy="1705213"/>
+            <wp:effectExtent l="0" t="0" r="0" b="9525"/>
+            <wp:docPr id="115" name="Imagem 115"/>
+            <wp:cNvGraphicFramePr>
+              <a:graphicFrameLocks xmlns:a="http://schemas.openxmlformats.org/drawingml/2006/main" noChangeAspect="1"/>
+            </wp:cNvGraphicFramePr>
+            <a:graphic xmlns:a="http://schemas.openxmlformats.org/drawingml/2006/main">
+              <a:graphicData uri="http://schemas.openxmlformats.org/drawingml/2006/picture">
+                <pic:pic xmlns:pic="http://schemas.openxmlformats.org/drawingml/2006/picture">
+                  <pic:nvPicPr>
+                    <pic:cNvPr id="1" name=""/>
+                    <pic:cNvPicPr/>
+                  </pic:nvPicPr>
+                  <pic:blipFill>
+                    <a:blip r:embed="rId93"/>
+                    <a:stretch>
+                      <a:fillRect/>
+                    </a:stretch>
+                  </pic:blipFill>
+                  <pic:spPr>
+                    <a:xfrm>
+                      <a:off x="0" y="0"/>
+                      <a:ext cx="3600953" cy="1705213"/>
+                    </a:xfrm>
+                    <a:prstGeom prst="rect">
+                      <a:avLst/>
+                    </a:prstGeom>
+                  </pic:spPr>
+                </pic:pic>
+              </a:graphicData>
+            </a:graphic>
+          </wp:inline>
+        </w:drawing>
+      </w:r>
+      <w:r>
+        <w:rPr>
+          <w:sz w:val="24"/>
+          <w:szCs w:val="24"/>
+        </w:rPr>
+        <w:t xml:space="preserve"> </w:t>
+      </w:r>
+      <w:r>
+        <w:rPr>
+          <w:sz w:val="24"/>
+          <w:szCs w:val="24"/>
+        </w:rPr>
+        <w:t xml:space="preserve"> </w:t>
+      </w:r>
+    </w:p>
+    <w:p>
+      <w:pPr>
+        <w:pStyle w:val="PargrafodaLista"/>
+        <w:tabs>
+          <w:tab w:val="left" w:pos="1275"/>
+        </w:tabs>
+        <w:rPr>
+          <w:sz w:val="24"/>
+          <w:szCs w:val="24"/>
+        </w:rPr>
+      </w:pPr>
+    </w:p>
+    <w:p>
+      <w:pPr>
+        <w:pStyle w:val="PargrafodaLista"/>
+        <w:tabs>
+          <w:tab w:val="left" w:pos="1275"/>
+        </w:tabs>
+        <w:rPr>
+          <w:sz w:val="24"/>
+          <w:szCs w:val="24"/>
+        </w:rPr>
+      </w:pPr>
+      <w:r>
+        <w:rPr>
+          <w:sz w:val="24"/>
+          <w:szCs w:val="24"/>
+        </w:rPr>
+        <w:t xml:space="preserve">60-  No cabeçalho da tabela </w:t>
+      </w:r>
+      <w:r>
+        <w:rPr>
+          <w:sz w:val="24"/>
+          <w:szCs w:val="24"/>
+        </w:rPr>
+        <w:t xml:space="preserve">adicionamos uma cor de fundo mudamos a cor do texto e deixamos </w:t>
+      </w:r>
+      <w:r>
+        <w:rPr>
+          <w:sz w:val="24"/>
+          <w:szCs w:val="24"/>
+        </w:rPr>
+        <w:t>mais encorpado.</w:t>
+      </w:r>
+    </w:p>
+    <w:p>
+      <w:pPr>
+        <w:pStyle w:val="PargrafodaLista"/>
+        <w:tabs>
+          <w:tab w:val="left" w:pos="1275"/>
+        </w:tabs>
+        <w:rPr>
+          <w:sz w:val="24"/>
+          <w:szCs w:val="24"/>
+        </w:rPr>
+      </w:pPr>
+    </w:p>
+    <w:p>
+      <w:pPr>
+        <w:pStyle w:val="PargrafodaLista"/>
+        <w:tabs>
+          <w:tab w:val="left" w:pos="1275"/>
+        </w:tabs>
+        <w:rPr>
+          <w:sz w:val="24"/>
+          <w:szCs w:val="24"/>
+        </w:rPr>
+      </w:pPr>
+      <w:r>
+        <w:rPr>
+          <w:sz w:val="24"/>
+          <w:szCs w:val="24"/>
+        </w:rPr>
+        <w:drawing>
+          <wp:inline distT="0" distB="0" distL="0" distR="0" wp14:anchorId="5ED1D85D" wp14:editId="4F356D9B">
+            <wp:extent cx="4706007" cy="1876687"/>
+            <wp:effectExtent l="0" t="0" r="0" b="9525"/>
+            <wp:docPr id="117" name="Imagem 117"/>
+            <wp:cNvGraphicFramePr>
+              <a:graphicFrameLocks xmlns:a="http://schemas.openxmlformats.org/drawingml/2006/main" noChangeAspect="1"/>
+            </wp:cNvGraphicFramePr>
+            <a:graphic xmlns:a="http://schemas.openxmlformats.org/drawingml/2006/main">
+              <a:graphicData uri="http://schemas.openxmlformats.org/drawingml/2006/picture">
+                <pic:pic xmlns:pic="http://schemas.openxmlformats.org/drawingml/2006/picture">
+                  <pic:nvPicPr>
+                    <pic:cNvPr id="1" name=""/>
+                    <pic:cNvPicPr/>
+                  </pic:nvPicPr>
+                  <pic:blipFill>
+                    <a:blip r:embed="rId94"/>
+                    <a:stretch>
+                      <a:fillRect/>
+                    </a:stretch>
+                  </pic:blipFill>
+                  <pic:spPr>
+                    <a:xfrm>
+                      <a:off x="0" y="0"/>
+                      <a:ext cx="4706007" cy="1876687"/>
+                    </a:xfrm>
+                    <a:prstGeom prst="rect">
+                      <a:avLst/>
+                    </a:prstGeom>
+                  </pic:spPr>
+                </pic:pic>
+              </a:graphicData>
+            </a:graphic>
+          </wp:inline>
+        </w:drawing>
+      </w:r>
+    </w:p>
+    <w:p>
+      <w:pPr>
+        <w:pStyle w:val="PargrafodaLista"/>
+        <w:tabs>
+          <w:tab w:val="left" w:pos="1275"/>
+        </w:tabs>
+        <w:rPr>
+          <w:sz w:val="24"/>
+          <w:szCs w:val="24"/>
+        </w:rPr>
+      </w:pPr>
+    </w:p>
+    <w:p>
+      <w:pPr>
+        <w:pStyle w:val="PargrafodaLista"/>
+        <w:tabs>
+          <w:tab w:val="left" w:pos="1275"/>
+        </w:tabs>
+        <w:rPr>
+          <w:sz w:val="24"/>
+          <w:szCs w:val="24"/>
+        </w:rPr>
+      </w:pPr>
+      <w:r>
+        <w:rPr>
+          <w:sz w:val="24"/>
+          <w:szCs w:val="24"/>
+        </w:rPr>
+        <w:t xml:space="preserve">61- </w:t>
+      </w:r>
+      <w:r>
+        <w:rPr>
+          <w:sz w:val="24"/>
+          <w:szCs w:val="24"/>
+        </w:rPr>
+        <w:t>Colocamos uma borda nos dados da tabela e no cabeçalho conforme código:</w:t>
+      </w:r>
+    </w:p>
+    <w:p>
+      <w:pPr>
+        <w:pStyle w:val="PargrafodaLista"/>
+        <w:tabs>
+          <w:tab w:val="left" w:pos="1275"/>
+        </w:tabs>
+        <w:rPr>
+          <w:sz w:val="24"/>
+          <w:szCs w:val="24"/>
+        </w:rPr>
+      </w:pPr>
+      <w:r>
+        <w:rPr>
+          <w:sz w:val="24"/>
+          <w:szCs w:val="24"/>
+        </w:rPr>
+        <w:drawing>
+          <wp:inline distT="0" distB="0" distL="0" distR="0" wp14:anchorId="27613D8B" wp14:editId="58B1EEE4">
+            <wp:extent cx="4696480" cy="1476581"/>
+            <wp:effectExtent l="0" t="0" r="8890" b="9525"/>
+            <wp:docPr id="118" name="Imagem 118"/>
+            <wp:cNvGraphicFramePr>
+              <a:graphicFrameLocks xmlns:a="http://schemas.openxmlformats.org/drawingml/2006/main" noChangeAspect="1"/>
+            </wp:cNvGraphicFramePr>
+            <a:graphic xmlns:a="http://schemas.openxmlformats.org/drawingml/2006/main">
+              <a:graphicData uri="http://schemas.openxmlformats.org/drawingml/2006/picture">
+                <pic:pic xmlns:pic="http://schemas.openxmlformats.org/drawingml/2006/picture">
+                  <pic:nvPicPr>
+                    <pic:cNvPr id="1" name=""/>
+                    <pic:cNvPicPr/>
+                  </pic:nvPicPr>
+                  <pic:blipFill>
+                    <a:blip r:embed="rId95"/>
+                    <a:stretch>
+                      <a:fillRect/>
+                    </a:stretch>
+                  </pic:blipFill>
+                  <pic:spPr>
+                    <a:xfrm>
+                      <a:off x="0" y="0"/>
+                      <a:ext cx="4696480" cy="1476581"/>
+                    </a:xfrm>
+                    <a:prstGeom prst="rect">
+                      <a:avLst/>
+                    </a:prstGeom>
+                  </pic:spPr>
+                </pic:pic>
+              </a:graphicData>
+            </a:graphic>
+          </wp:inline>
+        </w:drawing>
+      </w:r>
+    </w:p>
+    <w:p>
+      <w:pPr>
+        <w:pStyle w:val="PargrafodaLista"/>
+        <w:tabs>
+          <w:tab w:val="left" w:pos="1275"/>
+        </w:tabs>
+        <w:rPr>
+          <w:sz w:val="24"/>
+          <w:szCs w:val="24"/>
+        </w:rPr>
+      </w:pPr>
+    </w:p>
+    <w:p>
+      <w:pPr>
+        <w:pStyle w:val="PargrafodaLista"/>
+        <w:tabs>
+          <w:tab w:val="left" w:pos="1275"/>
+        </w:tabs>
+        <w:rPr>
+          <w:sz w:val="24"/>
+          <w:szCs w:val="24"/>
+        </w:rPr>
+      </w:pPr>
+      <w:r>
+        <w:rPr>
+          <w:sz w:val="24"/>
+          <w:szCs w:val="24"/>
+        </w:rPr>
+        <w:t xml:space="preserve">62 </w:t>
+      </w:r>
+      <w:r>
+        <w:rPr>
+          <w:sz w:val="24"/>
+          <w:szCs w:val="24"/>
+        </w:rPr>
+        <w:t>–</w:t>
+      </w:r>
+      <w:r>
+        <w:rPr>
+          <w:sz w:val="24"/>
+          <w:szCs w:val="24"/>
+        </w:rPr>
+        <w:t xml:space="preserve"> </w:t>
+      </w:r>
+      <w:r>
+        <w:rPr>
+          <w:sz w:val="24"/>
+          <w:szCs w:val="24"/>
+        </w:rPr>
+        <w:t>Agora vamos dar um espaço interno para cima e para baixo  e para os lado esquerdo e direito.</w:t>
+      </w:r>
+    </w:p>
+    <w:p>
+      <w:pPr>
+        <w:pStyle w:val="PargrafodaLista"/>
+        <w:tabs>
+          <w:tab w:val="left" w:pos="1275"/>
+        </w:tabs>
+        <w:rPr>
+          <w:sz w:val="24"/>
+          <w:szCs w:val="24"/>
+        </w:rPr>
+      </w:pPr>
+      <w:r>
+        <w:rPr>
+          <w:sz w:val="24"/>
+          <w:szCs w:val="24"/>
+        </w:rPr>
+        <w:drawing>
+          <wp:inline distT="0" distB="0" distL="0" distR="0" wp14:anchorId="6594DEF9" wp14:editId="3E18B9F5">
+            <wp:extent cx="5353797" cy="1810003"/>
+            <wp:effectExtent l="0" t="0" r="0" b="0"/>
+            <wp:docPr id="119" name="Imagem 119"/>
+            <wp:cNvGraphicFramePr>
+              <a:graphicFrameLocks xmlns:a="http://schemas.openxmlformats.org/drawingml/2006/main" noChangeAspect="1"/>
+            </wp:cNvGraphicFramePr>
+            <a:graphic xmlns:a="http://schemas.openxmlformats.org/drawingml/2006/main">
+              <a:graphicData uri="http://schemas.openxmlformats.org/drawingml/2006/picture">
+                <pic:pic xmlns:pic="http://schemas.openxmlformats.org/drawingml/2006/picture">
+                  <pic:nvPicPr>
+                    <pic:cNvPr id="1" name=""/>
+                    <pic:cNvPicPr/>
+                  </pic:nvPicPr>
+                  <pic:blipFill>
+                    <a:blip r:embed="rId96"/>
+                    <a:stretch>
+                      <a:fillRect/>
+                    </a:stretch>
+                  </pic:blipFill>
+                  <pic:spPr>
+                    <a:xfrm>
+                      <a:off x="0" y="0"/>
+                      <a:ext cx="5353797" cy="1810003"/>
+                    </a:xfrm>
+                    <a:prstGeom prst="rect">
+                      <a:avLst/>
+                    </a:prstGeom>
+                  </pic:spPr>
+                </pic:pic>
+              </a:graphicData>
+            </a:graphic>
+          </wp:inline>
+        </w:drawing>
+      </w:r>
+      <w:bookmarkStart w:id="0" w:name="_GoBack"/>
+      <w:bookmarkEnd w:id="0"/>
     </w:p>
     <w:sectPr>
       <w:pgSz w:w="11906" w:h="16838"/>
@@ -13651,7 +14364,7 @@
 </file>
 
 <file path=customXml/itemProps1.xml><?xml version="1.0" encoding="utf-8"?>
-<ds:datastoreItem xmlns:ds="http://schemas.openxmlformats.org/officeDocument/2006/customXml" ds:itemID="{91711E7C-BC2B-4CE9-8FBC-32AC95FB4AE5}">
+<ds:datastoreItem xmlns:ds="http://schemas.openxmlformats.org/officeDocument/2006/customXml" ds:itemID="{708ABD2B-0053-472E-8848-8C3C0C17F405}">
   <ds:schemaRefs>
     <ds:schemaRef ds:uri="http://schemas.openxmlformats.org/officeDocument/2006/bibliography"/>
   </ds:schemaRefs>

</xml_diff>